<commit_message>
increment-31 harden docx parsing and fix direct indexing smoke ocr parity
</commit_message>
<xml_diff>
--- a/backend/examples/cases/release_go_no_go_multifile_case/input/05_release_notes.docx
+++ b/backend/examples/cases/release_go_no_go_multifile_case/input/05_release_notes.docx
@@ -30,6 +30,169 @@
     </w:p>
     <w:p>
       <w:pPr>
+        <w:pStyle w:val="ListNumber"/>
+      </w:pPr>
+      <w:r>
+        <w:t>1. Confirm deployment window with SRE.</w:t>
+      </w:r>
+    </w:p>
+    <w:p>
+      <w:pPr>
+        <w:pStyle w:val="ListNumber"/>
+      </w:pPr>
+      <w:r>
+        <w:t>2. Confirm rollback owner is on-call.</w:t>
+      </w:r>
+    </w:p>
+    <w:p>
+      <w:pPr>
+        <w:pStyle w:val="Heading2"/>
+      </w:pPr>
+      <w:r>
+        <w:t>Approval Matrix</w:t>
+      </w:r>
+    </w:p>
+    <w:tbl>
+      <w:tblPr>
+        <w:tblW w:type="auto" w:w="0"/>
+        <w:tblLook w:firstColumn="1" w:firstRow="1" w:lastColumn="0" w:lastRow="0" w:noHBand="0" w:noVBand="1" w:val="04A0"/>
+      </w:tblPr>
+      <w:tblGrid>
+        <w:gridCol w:w="2880"/>
+        <w:gridCol w:w="2880"/>
+        <w:gridCol w:w="2880"/>
+      </w:tblGrid>
+      <w:tr>
+        <w:tc>
+          <w:tcPr>
+            <w:tcW w:type="dxa" w:w="2880"/>
+          </w:tcPr>
+          <w:p>
+            <w:r>
+              <w:t>Check</w:t>
+            </w:r>
+          </w:p>
+        </w:tc>
+        <w:tc>
+          <w:tcPr>
+            <w:tcW w:type="dxa" w:w="2880"/>
+          </w:tcPr>
+          <w:p>
+            <w:r>
+              <w:t>Owner</w:t>
+            </w:r>
+          </w:p>
+        </w:tc>
+        <w:tc>
+          <w:tcPr>
+            <w:tcW w:type="dxa" w:w="2880"/>
+          </w:tcPr>
+          <w:p>
+            <w:r>
+              <w:t>Status</w:t>
+            </w:r>
+          </w:p>
+        </w:tc>
+      </w:tr>
+      <w:tr>
+        <w:tc>
+          <w:tcPr>
+            <w:tcW w:type="dxa" w:w="2880"/>
+          </w:tcPr>
+          <w:p>
+            <w:r>
+              <w:t>Security sign-off</w:t>
+            </w:r>
+          </w:p>
+        </w:tc>
+        <w:tc>
+          <w:tcPr>
+            <w:tcW w:type="dxa" w:w="2880"/>
+          </w:tcPr>
+          <w:p>
+            <w:r>
+              <w:t>Security Lead</w:t>
+            </w:r>
+          </w:p>
+        </w:tc>
+        <w:tc>
+          <w:tcPr>
+            <w:tcW w:type="dxa" w:w="2880"/>
+          </w:tcPr>
+          <w:p>
+            <w:r>
+              <w:t>PENDING</w:t>
+            </w:r>
+          </w:p>
+        </w:tc>
+      </w:tr>
+      <w:tr>
+        <w:tc>
+          <w:tcPr>
+            <w:tcW w:type="dxa" w:w="2880"/>
+          </w:tcPr>
+          <w:p>
+            <w:r>
+              <w:t>Rollback readiness</w:t>
+            </w:r>
+          </w:p>
+        </w:tc>
+        <w:tc>
+          <w:tcPr>
+            <w:tcW w:type="dxa" w:w="2880"/>
+          </w:tcPr>
+          <w:p>
+            <w:r>
+              <w:t>SRE</w:t>
+            </w:r>
+          </w:p>
+        </w:tc>
+        <w:tc>
+          <w:tcPr>
+            <w:tcW w:type="dxa" w:w="2880"/>
+          </w:tcPr>
+          <w:p>
+            <w:r>
+              <w:t>READY</w:t>
+            </w:r>
+          </w:p>
+        </w:tc>
+      </w:tr>
+      <w:tr>
+        <w:tc>
+          <w:tcPr>
+            <w:tcW w:type="dxa" w:w="2880"/>
+          </w:tcPr>
+          <w:p>
+            <w:r>
+              <w:t>Customer notification</w:t>
+            </w:r>
+          </w:p>
+        </w:tc>
+        <w:tc>
+          <w:tcPr>
+            <w:tcW w:type="dxa" w:w="2880"/>
+          </w:tcPr>
+          <w:p>
+            <w:r>
+              <w:t>Product Owner</w:t>
+            </w:r>
+          </w:p>
+        </w:tc>
+        <w:tc>
+          <w:tcPr>
+            <w:tcW w:type="dxa" w:w="2880"/>
+          </w:tcPr>
+          <w:p>
+            <w:r>
+              <w:t>APPROVED</w:t>
+            </w:r>
+          </w:p>
+        </w:tc>
+      </w:tr>
+    </w:tbl>
+    <w:p>
+      <w:pPr>
         <w:pStyle w:val="Heading2"/>
       </w:pPr>
       <w:r>
@@ -44,6 +207,24 @@
     <w:p>
       <w:r>
         <w:t>Customer notification copy is ready and waiting for product owner sign-off.</w:t>
+      </w:r>
+    </w:p>
+    <w:p>
+      <w:pPr>
+        <w:pStyle w:val="Heading2"/>
+      </w:pPr>
+      <w:r>
+        <w:t>Appendix A: Rollback Contacts</w:t>
+      </w:r>
+    </w:p>
+    <w:p>
+      <w:r>
+        <w:t>Primary on-call: sre-primary@example.com</w:t>
+      </w:r>
+    </w:p>
+    <w:p>
+      <w:r>
+        <w:t>Secondary on-call: sre-secondary@example.com</w:t>
       </w:r>
     </w:p>
     <w:sectPr>

</xml_diff>